<commit_message>
Done print preview docx ranap anak
fix kode dokumen rm
</commit_message>
<xml_diff>
--- a/public/doc/emr/print_rajal_anak_dokter.docx
+++ b/public/doc/emr/print_rajal_anak_dokter.docx
@@ -509,7 +509,17 @@
                 <w:sz w:val="26"/>
                 <w:szCs w:val="26"/>
               </w:rPr>
-              <w:t>RM 3 e 1</w:t>
+              <w:t xml:space="preserve">RM </w:t>
+            </w:r>
+            <w:r>
+              <w:rPr>
+                <w:b/>
+                <w:bCs/>
+                <w:noProof/>
+                <w:sz w:val="26"/>
+                <w:szCs w:val="26"/>
+              </w:rPr>
+              <w:t>03 e 4</w:t>
             </w:r>
           </w:p>
         </w:tc>
@@ -2501,7 +2511,6 @@
         <w:lang w:val="en-ID"/>
       </w:rPr>
     </w:pPr>
-    <w:proofErr w:type="spellStart"/>
     <w:r>
       <w:rPr>
         <w:i/>
@@ -2509,76 +2518,7 @@
         <w:sz w:val="16"/>
         <w:szCs w:val="20"/>
       </w:rPr>
-      <w:t>Formulir</w:t>
-    </w:r>
-    <w:proofErr w:type="spellEnd"/>
-    <w:r>
-      <w:rPr>
-        <w:i/>
-        <w:iCs/>
-        <w:sz w:val="16"/>
-        <w:szCs w:val="20"/>
-      </w:rPr>
-      <w:t xml:space="preserve"> </w:t>
-    </w:r>
-    <w:proofErr w:type="spellStart"/>
-    <w:r>
-      <w:rPr>
-        <w:i/>
-        <w:iCs/>
-        <w:sz w:val="16"/>
-        <w:szCs w:val="20"/>
-      </w:rPr>
-      <w:t>ini</w:t>
-    </w:r>
-    <w:proofErr w:type="spellEnd"/>
-    <w:r>
-      <w:rPr>
-        <w:i/>
-        <w:iCs/>
-        <w:sz w:val="16"/>
-        <w:szCs w:val="20"/>
-      </w:rPr>
-      <w:t xml:space="preserve"> </w:t>
-    </w:r>
-    <w:proofErr w:type="spellStart"/>
-    <w:r>
-      <w:rPr>
-        <w:i/>
-        <w:iCs/>
-        <w:sz w:val="16"/>
-        <w:szCs w:val="20"/>
-      </w:rPr>
-      <w:t>dicetak</w:t>
-    </w:r>
-    <w:proofErr w:type="spellEnd"/>
-    <w:r>
-      <w:rPr>
-        <w:i/>
-        <w:iCs/>
-        <w:sz w:val="16"/>
-        <w:szCs w:val="20"/>
-      </w:rPr>
-      <w:t xml:space="preserve"> pada ${</w:t>
-    </w:r>
-    <w:r>
-      <w:rPr>
-        <w:i/>
-        <w:iCs/>
-        <w:sz w:val="16"/>
-        <w:szCs w:val="20"/>
-        <w:lang w:val="en-ID"/>
-      </w:rPr>
-      <w:t>TANGGAL_CETAK</w:t>
-    </w:r>
-    <w:r>
-      <w:rPr>
-        <w:i/>
-        <w:iCs/>
-        <w:sz w:val="16"/>
-        <w:szCs w:val="20"/>
-      </w:rPr>
-      <w:t>}</w:t>
+      <w:t>Rev. II/2026</w:t>
     </w:r>
   </w:p>
 </w:ftr>

</xml_diff>